<commit_message>
"changed to right teacher in docs"
</commit_message>
<xml_diff>
--- a/lab2/doc/209_Буланов_Лаб2.docx
+++ b/lab2/doc/209_Буланов_Лаб2.docx
@@ -464,7 +464,21 @@
           <w:rFonts w:eastAsia="Times New Roman" w:cs="Times New Roman"/>
           <w:szCs w:val="28"/>
         </w:rPr>
-        <w:t>Б-2</w:t>
+        <w:t>Б</w:t>
+      </w:r>
+      <w:r>
+        <w:rPr>
+          <w:rFonts w:eastAsia="Times New Roman" w:cs="Times New Roman"/>
+          <w:szCs w:val="28"/>
+        </w:rPr>
+        <w:t>В</w:t>
+      </w:r>
+      <w:r>
+        <w:rPr>
+          <w:rFonts w:eastAsia="Times New Roman" w:cs="Times New Roman"/>
+          <w:szCs w:val="28"/>
+        </w:rPr>
+        <w:t>-2</w:t>
       </w:r>
       <w:r>
         <w:t>4</w:t>
@@ -530,7 +544,7 @@
           <w:rFonts w:eastAsia="Times New Roman" w:cs="Times New Roman"/>
           <w:szCs w:val="28"/>
         </w:rPr>
-        <w:t>Тихонов Ф.А</w:t>
+        <w:t>Миронов Е.С.</w:t>
       </w:r>
     </w:p>
     <w:p>
@@ -1771,7 +1785,7 @@
           <w:color w:val="333333"/>
           <w:sz w:val="20"/>
           <w:szCs w:val="20"/>
-          <w:lang w:eastAsia="ru-RU"/>
+          <w:lang w:val="en-US" w:eastAsia="ru-RU"/>
         </w:rPr>
       </w:pPr>
       <w:r>
@@ -1780,7 +1794,7 @@
           <w:color w:val="557799"/>
           <w:sz w:val="20"/>
           <w:szCs w:val="20"/>
-          <w:lang w:eastAsia="ru-RU"/>
+          <w:lang w:val="en-US" w:eastAsia="ru-RU"/>
         </w:rPr>
         <w:t>#include</w:t>
       </w:r>
@@ -1790,7 +1804,7 @@
           <w:color w:val="BBBBBB"/>
           <w:sz w:val="20"/>
           <w:szCs w:val="20"/>
-          <w:lang w:eastAsia="ru-RU"/>
+          <w:lang w:val="en-US" w:eastAsia="ru-RU"/>
         </w:rPr>
         <w:t xml:space="preserve"> </w:t>
       </w:r>
@@ -1800,7 +1814,7 @@
           <w:color w:val="888888"/>
           <w:sz w:val="20"/>
           <w:szCs w:val="20"/>
-          <w:lang w:eastAsia="ru-RU"/>
+          <w:lang w:val="en-US" w:eastAsia="ru-RU"/>
         </w:rPr>
         <w:t>&lt;time.h&gt;</w:t>
       </w:r>
@@ -1833,7 +1847,7 @@
           <w:color w:val="333333"/>
           <w:sz w:val="20"/>
           <w:szCs w:val="20"/>
-          <w:lang w:eastAsia="ru-RU"/>
+          <w:lang w:val="en-US" w:eastAsia="ru-RU"/>
         </w:rPr>
       </w:pPr>
     </w:p>
@@ -4427,16 +4441,16 @@
           <w:color w:val="333333"/>
           <w:sz w:val="20"/>
           <w:szCs w:val="20"/>
-          <w:lang w:eastAsia="ru-RU"/>
-        </w:rPr>
-      </w:pPr>
-      <w:r>
-        <w:rPr>
-          <w:rFonts w:ascii="Courier New" w:eastAsia="Times New Roman" w:hAnsi="Courier New" w:cs="Courier New"/>
-          <w:color w:val="333333"/>
-          <w:sz w:val="20"/>
-          <w:szCs w:val="20"/>
-          <w:lang w:eastAsia="ru-RU"/>
+          <w:lang w:val="en-US" w:eastAsia="ru-RU"/>
+        </w:rPr>
+      </w:pPr>
+      <w:r>
+        <w:rPr>
+          <w:rFonts w:ascii="Courier New" w:eastAsia="Times New Roman" w:hAnsi="Courier New" w:cs="Courier New"/>
+          <w:color w:val="333333"/>
+          <w:sz w:val="20"/>
+          <w:szCs w:val="20"/>
+          <w:lang w:val="en-US" w:eastAsia="ru-RU"/>
         </w:rPr>
         <w:t>}</w:t>
       </w:r>
@@ -4469,7 +4483,7 @@
           <w:color w:val="333333"/>
           <w:sz w:val="20"/>
           <w:szCs w:val="20"/>
-          <w:lang w:eastAsia="ru-RU"/>
+          <w:lang w:val="en-US" w:eastAsia="ru-RU"/>
         </w:rPr>
       </w:pPr>
     </w:p>
@@ -16062,7 +16076,7 @@
           <w:color w:val="333333"/>
           <w:sz w:val="20"/>
           <w:szCs w:val="20"/>
-          <w:lang w:eastAsia="ru-RU"/>
+          <w:lang w:val="en-US" w:eastAsia="ru-RU"/>
         </w:rPr>
       </w:pPr>
       <w:r>
@@ -16082,7 +16096,7 @@
           <w:color w:val="333333"/>
           <w:sz w:val="20"/>
           <w:szCs w:val="20"/>
-          <w:lang w:eastAsia="ru-RU"/>
+          <w:lang w:val="en-US" w:eastAsia="ru-RU"/>
         </w:rPr>
         <w:t>}</w:t>
       </w:r>
@@ -16115,16 +16129,16 @@
           <w:color w:val="333333"/>
           <w:sz w:val="20"/>
           <w:szCs w:val="20"/>
-          <w:lang w:eastAsia="ru-RU"/>
-        </w:rPr>
-      </w:pPr>
-      <w:r>
-        <w:rPr>
-          <w:rFonts w:ascii="Courier New" w:eastAsia="Times New Roman" w:hAnsi="Courier New" w:cs="Courier New"/>
-          <w:color w:val="BBBBBB"/>
-          <w:sz w:val="20"/>
-          <w:szCs w:val="20"/>
-          <w:lang w:eastAsia="ru-RU"/>
+          <w:lang w:val="en-US" w:eastAsia="ru-RU"/>
+        </w:rPr>
+      </w:pPr>
+      <w:r>
+        <w:rPr>
+          <w:rFonts w:ascii="Courier New" w:eastAsia="Times New Roman" w:hAnsi="Courier New" w:cs="Courier New"/>
+          <w:color w:val="BBBBBB"/>
+          <w:sz w:val="20"/>
+          <w:szCs w:val="20"/>
+          <w:lang w:val="en-US" w:eastAsia="ru-RU"/>
         </w:rPr>
         <w:t xml:space="preserve">    </w:t>
       </w:r>
@@ -16166,7 +16180,7 @@
           <w:color w:val="BBBBBB"/>
           <w:sz w:val="20"/>
           <w:szCs w:val="20"/>
-          <w:lang w:eastAsia="ru-RU"/>
+          <w:lang w:val="en-US" w:eastAsia="ru-RU"/>
         </w:rPr>
         <w:t xml:space="preserve">    </w:t>
       </w:r>
@@ -20536,7 +20550,7 @@
           <w:color w:val="333333"/>
           <w:sz w:val="20"/>
           <w:szCs w:val="20"/>
-          <w:lang w:val="en-US" w:eastAsia="ru-RU"/>
+          <w:lang w:eastAsia="ru-RU"/>
         </w:rPr>
       </w:pPr>
       <w:r>
@@ -20578,7 +20592,7 @@
           <w:color w:val="333333"/>
           <w:sz w:val="20"/>
           <w:szCs w:val="20"/>
-          <w:lang w:val="en-US" w:eastAsia="ru-RU"/>
+          <w:lang w:eastAsia="ru-RU"/>
         </w:rPr>
       </w:pPr>
     </w:p>
@@ -25616,7 +25630,7 @@
           <w:color w:val="333333"/>
           <w:sz w:val="20"/>
           <w:szCs w:val="20"/>
-          <w:lang w:val="en-US" w:eastAsia="ru-RU"/>
+          <w:lang w:eastAsia="ru-RU"/>
         </w:rPr>
       </w:pPr>
     </w:p>
@@ -27551,15 +27565,42 @@
           <w:rFonts w:ascii="12" w:hAnsi="12"/>
           <w:sz w:val="24"/>
           <w:szCs w:val="24"/>
-        </w:rPr>
-      </w:pPr>
-      <w:r>
-        <w:rPr>
-          <w:rFonts w:ascii="12" w:hAnsi="12"/>
-          <w:sz w:val="24"/>
-          <w:szCs w:val="24"/>
-        </w:rPr>
-        <w:t xml:space="preserve">Введена комманда </w:t>
+          <w:lang w:val="en-US"/>
+        </w:rPr>
+      </w:pPr>
+      <w:r>
+        <w:rPr>
+          <w:rFonts w:ascii="12" w:hAnsi="12"/>
+          <w:sz w:val="24"/>
+          <w:szCs w:val="24"/>
+        </w:rPr>
+        <w:t>Введена</w:t>
+      </w:r>
+      <w:r>
+        <w:rPr>
+          <w:rFonts w:ascii="12" w:hAnsi="12"/>
+          <w:sz w:val="24"/>
+          <w:szCs w:val="24"/>
+          <w:lang w:val="en-US"/>
+        </w:rPr>
+        <w:t xml:space="preserve"> </w:t>
+      </w:r>
+      <w:r>
+        <w:rPr>
+          <w:rFonts w:ascii="12" w:hAnsi="12"/>
+          <w:sz w:val="24"/>
+          <w:szCs w:val="24"/>
+        </w:rPr>
+        <w:t>комманда</w:t>
+      </w:r>
+      <w:r>
+        <w:rPr>
+          <w:rFonts w:ascii="12" w:hAnsi="12"/>
+          <w:sz w:val="24"/>
+          <w:szCs w:val="24"/>
+          <w:lang w:val="en-US"/>
+        </w:rPr>
+        <w:t xml:space="preserve"> </w:t>
       </w:r>
     </w:p>
     <w:p>

</xml_diff>